<commit_message>
Add contract generation with pre-fill modal and company settings
</commit_message>
<xml_diff>
--- a/templates/contracts/sales_brokerage_agreement.docx
+++ b/templates/contracts/sales_brokerage_agreement.docx
@@ -8,16 +8,24 @@
       </w:pPr>
       <w:r>
         <w:rPr>
+          <w:rFonts w:ascii="Helvetica" w:hAnsi="Arial"/>
           <w:b/>
+          <w:sz w:val="22"/>
         </w:rPr>
         <w:t>CONTRAT DE VENTE ET DE COURTAGE</w:t>
       </w:r>
       <w:r>
+        <w:rPr>
+          <w:rFonts w:ascii="Helvetica" w:hAnsi="Arial"/>
+          <w:sz w:val="22"/>
+        </w:rPr>
         <w:br/>
       </w:r>
       <w:r>
         <w:rPr>
+          <w:rFonts w:ascii="Traditional Arabic" w:hAnsi="Traditional Arabic" w:cs="Traditional Arabic"/>
           <w:b/>
+          <w:sz w:val="24"/>
         </w:rPr>
         <w:t>عقد بيع و وساطة</w:t>
       </w:r>
@@ -39,6 +47,11 @@
           </w:tcPr>
           <w:p>
             <w:r>
+              <w:rPr>
+                <w:rFonts w:ascii="Helvetica" w:hAnsi="Arial"/>
+                <w:b/>
+                <w:sz w:val="22"/>
+              </w:rPr>
               <w:t>Entre les soussignés : AXIRA TRADING FZE (E.A.U.), licence {{fze_license_number}}, sise à {{fze_address}}, représentée par {{fze_representative}} en qualité de {{fze_position}}, agissant par son représentant local AXIRA AUTO (Algérie), licence {{auto_license_number}}, sise à {{auto_address}}, représentée par {{auto_representative}} en qualité de {{auto_position}} (ci-après « Axira »). Et : le Client {{client_full_name}}, titulaire de la pièce d'identité/passeport n° {{client_id_number}}, délivré le {{client_id_issue_date}} à {{client_id_issue_place}}, demeurant à {{client_address}}, contact {{client_phone}} / {{client_email}} (ci-après « le Client »).</w:t>
             </w:r>
           </w:p>
@@ -55,7 +68,7 @@
             <w:r>
               <w:rPr>
                 <w:rFonts w:ascii="Traditional Arabic" w:hAnsi="Traditional Arabic" w:cs="Traditional Arabic"/>
-                <w:b w:val="0"/>
+                <w:b/>
                 <w:sz w:val="24"/>
               </w:rPr>
               <w:t>بين الموقعين أدناه: شركة AXIRA TRADING FZE المسجلة في دبي، الإمارات العربية المتحدة، تحت رخصة رقم {{fze_license_number}} والكائنة في {{fze_address}}، ويمثلها {{fze_representative}} بصفته {{fze_position}}، وتعمل عبر ممثلها المحلي AXIRA AUTO المسجلة في الجزائر تحت رخصة رقم {{auto_license_number}} والكائنة في {{auto_address}} ويمثلها {{auto_representative}} بصفته {{auto_position}} (ويشار إليها لاحقًا بـ «أكسيرا»). ومن جهة أخرى: العميل {{client_full_name}} حامل بطاقة الهوية/جواز السفر رقم {{client_id_number}} الصادر بتاريخ {{client_id_issue_date}} في {{client_id_issue_place}} والمقيم في {{client_address}} هاتف {{client_phone}} / بريد {{client_email}} (ويشار إليه لاحقًا بـ «العميل»).</w:t>
@@ -74,7 +87,7 @@
             </w:pPr>
             <w:r>
               <w:rPr>
-                <w:rFonts w:ascii="Calibri" w:hAnsi="Calibri"/>
+                <w:rFonts w:ascii="Helvetica" w:hAnsi="Arial"/>
                 <w:b w:val="0"/>
                 <w:sz w:val="22"/>
               </w:rPr>
@@ -113,7 +126,7 @@
             </w:pPr>
             <w:r>
               <w:rPr>
-                <w:rFonts w:ascii="Calibri" w:hAnsi="Calibri"/>
+                <w:rFonts w:ascii="Helvetica" w:hAnsi="Arial"/>
                 <w:b/>
                 <w:sz w:val="22"/>
               </w:rPr>
@@ -152,7 +165,7 @@
             </w:pPr>
             <w:r>
               <w:rPr>
-                <w:rFonts w:ascii="Calibri" w:hAnsi="Calibri"/>
+                <w:rFonts w:ascii="Helvetica" w:hAnsi="Arial"/>
                 <w:b w:val="0"/>
                 <w:sz w:val="22"/>
               </w:rPr>
@@ -199,7 +212,7 @@
             </w:pPr>
             <w:r>
               <w:rPr>
-                <w:rFonts w:ascii="Calibri" w:hAnsi="Calibri"/>
+                <w:rFonts w:ascii="Helvetica" w:hAnsi="Arial"/>
                 <w:b/>
                 <w:sz w:val="22"/>
               </w:rPr>
@@ -238,8 +251,8 @@
             </w:pPr>
             <w:r>
               <w:rPr>
-                <w:rFonts w:ascii="Calibri" w:hAnsi="Calibri"/>
-                <w:b w:val="0"/>
+                <w:rFonts w:ascii="Helvetica" w:hAnsi="Arial"/>
+                <w:b/>
                 <w:sz w:val="22"/>
               </w:rPr>
               <w:t>Marque: {{vehicle_brand}}</w:t>
@@ -284,7 +297,7 @@
             <w:r>
               <w:rPr>
                 <w:rFonts w:ascii="Traditional Arabic" w:hAnsi="Traditional Arabic" w:cs="Traditional Arabic"/>
-                <w:b w:val="0"/>
+                <w:b/>
                 <w:sz w:val="24"/>
               </w:rPr>
               <w:t>العلامة: {{vehicle_brand}}</w:t>
@@ -329,7 +342,7 @@
             </w:pPr>
             <w:r>
               <w:rPr>
-                <w:rFonts w:ascii="Calibri" w:hAnsi="Calibri"/>
+                <w:rFonts w:ascii="Helvetica" w:hAnsi="Arial"/>
                 <w:b/>
                 <w:sz w:val="22"/>
               </w:rPr>
@@ -368,8 +381,8 @@
             </w:pPr>
             <w:r>
               <w:rPr>
-                <w:rFonts w:ascii="Calibri" w:hAnsi="Calibri"/>
-                <w:b w:val="0"/>
+                <w:rFonts w:ascii="Helvetica" w:hAnsi="Arial"/>
+                <w:b/>
                 <w:sz w:val="22"/>
               </w:rPr>
               <w:t>{{#is_brand_new}}</w:t>
@@ -398,7 +411,7 @@
             <w:r>
               <w:rPr>
                 <w:rFonts w:ascii="Traditional Arabic" w:hAnsi="Traditional Arabic" w:cs="Traditional Arabic"/>
-                <w:b w:val="0"/>
+                <w:b/>
                 <w:sz w:val="24"/>
               </w:rPr>
               <w:t>{{#is_brand_new}}</w:t>
@@ -427,7 +440,7 @@
             </w:pPr>
             <w:r>
               <w:rPr>
-                <w:rFonts w:ascii="Calibri" w:hAnsi="Calibri"/>
+                <w:rFonts w:ascii="Helvetica" w:hAnsi="Arial"/>
                 <w:b/>
                 <w:sz w:val="22"/>
               </w:rPr>
@@ -466,8 +479,8 @@
             </w:pPr>
             <w:r>
               <w:rPr>
-                <w:rFonts w:ascii="Calibri" w:hAnsi="Calibri"/>
-                <w:b w:val="0"/>
+                <w:rFonts w:ascii="Helvetica" w:hAnsi="Arial"/>
+                <w:b/>
                 <w:sz w:val="22"/>
               </w:rPr>
               <w:t>4.1 Le prix total convenu est de {{total_price_dzd}} DZD (en toutes lettres : {{total_price_words}}).</w:t>
@@ -492,7 +505,7 @@
             <w:r>
               <w:rPr>
                 <w:rFonts w:ascii="Traditional Arabic" w:hAnsi="Traditional Arabic" w:cs="Traditional Arabic"/>
-                <w:b w:val="0"/>
+                <w:b/>
                 <w:sz w:val="24"/>
               </w:rPr>
               <w:t>4.1 السعر الإجمالي المتفق عليه هو {{total_price_dzd}} دج (كتابة: {{total_price_words}}).</w:t>
@@ -517,7 +530,7 @@
             </w:pPr>
             <w:r>
               <w:rPr>
-                <w:rFonts w:ascii="Calibri" w:hAnsi="Calibri"/>
+                <w:rFonts w:ascii="Helvetica" w:hAnsi="Arial"/>
                 <w:b/>
                 <w:sz w:val="22"/>
               </w:rPr>
@@ -556,8 +569,8 @@
             </w:pPr>
             <w:r>
               <w:rPr>
-                <w:rFonts w:ascii="Calibri" w:hAnsi="Calibri"/>
-                <w:b w:val="0"/>
+                <w:rFonts w:ascii="Helvetica" w:hAnsi="Arial"/>
+                <w:b/>
                 <w:sz w:val="22"/>
               </w:rPr>
               <w:t>{{#is_full_payment}}</w:t>
@@ -590,7 +603,7 @@
             <w:r>
               <w:rPr>
                 <w:rFonts w:ascii="Traditional Arabic" w:hAnsi="Traditional Arabic" w:cs="Traditional Arabic"/>
-                <w:b w:val="0"/>
+                <w:b/>
                 <w:sz w:val="24"/>
               </w:rPr>
               <w:t>{{#is_full_payment}}</w:t>
@@ -623,7 +636,7 @@
             </w:pPr>
             <w:r>
               <w:rPr>
-                <w:rFonts w:ascii="Calibri" w:hAnsi="Calibri"/>
+                <w:rFonts w:ascii="Helvetica" w:hAnsi="Arial"/>
                 <w:b/>
                 <w:sz w:val="22"/>
               </w:rPr>
@@ -662,7 +675,7 @@
             </w:pPr>
             <w:r>
               <w:rPr>
-                <w:rFonts w:ascii="Calibri" w:hAnsi="Calibri"/>
+                <w:rFonts w:ascii="Helvetica" w:hAnsi="Arial"/>
                 <w:b w:val="0"/>
                 <w:sz w:val="22"/>
               </w:rPr>
@@ -709,7 +722,7 @@
             </w:pPr>
             <w:r>
               <w:rPr>
-                <w:rFonts w:ascii="Calibri" w:hAnsi="Calibri"/>
+                <w:rFonts w:ascii="Helvetica" w:hAnsi="Arial"/>
                 <w:b/>
                 <w:sz w:val="22"/>
               </w:rPr>
@@ -748,8 +761,8 @@
             </w:pPr>
             <w:r>
               <w:rPr>
-                <w:rFonts w:ascii="Calibri" w:hAnsi="Calibri"/>
-                <w:b w:val="0"/>
+                <w:rFonts w:ascii="Helvetica" w:hAnsi="Arial"/>
+                <w:b/>
                 <w:sz w:val="22"/>
               </w:rPr>
               <w:t>7.1 Délai estimatif: {{lead_time_days}} jours à compter du paiement intégral (ou de la commande fournisseur en cas d'acompte).</w:t>
@@ -774,7 +787,7 @@
             <w:r>
               <w:rPr>
                 <w:rFonts w:ascii="Traditional Arabic" w:hAnsi="Traditional Arabic" w:cs="Traditional Arabic"/>
-                <w:b w:val="0"/>
+                <w:b/>
                 <w:sz w:val="24"/>
               </w:rPr>
               <w:t>7.1 مدة التوريد التقديرية: {{lead_time_days}} يومًا من تاريخ السداد الكامل (أو من تاريخ إصدار طلب المورد في حالة الدفعة المقدمة).</w:t>
@@ -799,7 +812,7 @@
             </w:pPr>
             <w:r>
               <w:rPr>
-                <w:rFonts w:ascii="Calibri" w:hAnsi="Calibri"/>
+                <w:rFonts w:ascii="Helvetica" w:hAnsi="Arial"/>
                 <w:b/>
                 <w:sz w:val="22"/>
               </w:rPr>
@@ -838,7 +851,7 @@
             </w:pPr>
             <w:r>
               <w:rPr>
-                <w:rFonts w:ascii="Calibri" w:hAnsi="Calibri"/>
+                <w:rFonts w:ascii="Helvetica" w:hAnsi="Arial"/>
                 <w:b w:val="0"/>
                 <w:sz w:val="22"/>
               </w:rPr>
@@ -885,7 +898,7 @@
             </w:pPr>
             <w:r>
               <w:rPr>
-                <w:rFonts w:ascii="Calibri" w:hAnsi="Calibri"/>
+                <w:rFonts w:ascii="Helvetica" w:hAnsi="Arial"/>
                 <w:b/>
                 <w:sz w:val="22"/>
               </w:rPr>
@@ -924,7 +937,7 @@
             </w:pPr>
             <w:r>
               <w:rPr>
-                <w:rFonts w:ascii="Calibri" w:hAnsi="Calibri"/>
+                <w:rFonts w:ascii="Helvetica" w:hAnsi="Arial"/>
                 <w:b w:val="0"/>
                 <w:sz w:val="22"/>
               </w:rPr>
@@ -971,7 +984,7 @@
             </w:pPr>
             <w:r>
               <w:rPr>
-                <w:rFonts w:ascii="Calibri" w:hAnsi="Calibri"/>
+                <w:rFonts w:ascii="Helvetica" w:hAnsi="Arial"/>
                 <w:b/>
                 <w:sz w:val="22"/>
               </w:rPr>
@@ -1010,7 +1023,7 @@
             </w:pPr>
             <w:r>
               <w:rPr>
-                <w:rFonts w:ascii="Calibri" w:hAnsi="Calibri"/>
+                <w:rFonts w:ascii="Helvetica" w:hAnsi="Arial"/>
                 <w:b w:val="0"/>
                 <w:sz w:val="22"/>
               </w:rPr>
@@ -1053,7 +1066,7 @@
             </w:pPr>
             <w:r>
               <w:rPr>
-                <w:rFonts w:ascii="Calibri" w:hAnsi="Calibri"/>
+                <w:rFonts w:ascii="Helvetica" w:hAnsi="Arial"/>
                 <w:b/>
                 <w:sz w:val="22"/>
               </w:rPr>
@@ -1092,7 +1105,7 @@
             </w:pPr>
             <w:r>
               <w:rPr>
-                <w:rFonts w:ascii="Calibri" w:hAnsi="Calibri"/>
+                <w:rFonts w:ascii="Helvetica" w:hAnsi="Arial"/>
                 <w:b w:val="0"/>
                 <w:sz w:val="22"/>
               </w:rPr>
@@ -1131,7 +1144,7 @@
             </w:pPr>
             <w:r>
               <w:rPr>
-                <w:rFonts w:ascii="Calibri" w:hAnsi="Calibri"/>
+                <w:rFonts w:ascii="Helvetica" w:hAnsi="Arial"/>
                 <w:b/>
                 <w:sz w:val="22"/>
               </w:rPr>
@@ -1170,7 +1183,7 @@
             </w:pPr>
             <w:r>
               <w:rPr>
-                <w:rFonts w:ascii="Calibri" w:hAnsi="Calibri"/>
+                <w:rFonts w:ascii="Helvetica" w:hAnsi="Arial"/>
                 <w:b w:val="0"/>
                 <w:sz w:val="22"/>
               </w:rPr>
@@ -1217,7 +1230,7 @@
             </w:pPr>
             <w:r>
               <w:rPr>
-                <w:rFonts w:ascii="Calibri" w:hAnsi="Calibri"/>
+                <w:rFonts w:ascii="Helvetica" w:hAnsi="Arial"/>
                 <w:b/>
                 <w:sz w:val="22"/>
               </w:rPr>
@@ -1256,7 +1269,7 @@
             </w:pPr>
             <w:r>
               <w:rPr>
-                <w:rFonts w:ascii="Calibri" w:hAnsi="Calibri"/>
+                <w:rFonts w:ascii="Helvetica" w:hAnsi="Arial"/>
                 <w:b w:val="0"/>
                 <w:sz w:val="22"/>
               </w:rPr>
@@ -1303,7 +1316,7 @@
             </w:pPr>
             <w:r>
               <w:rPr>
-                <w:rFonts w:ascii="Calibri" w:hAnsi="Calibri"/>
+                <w:rFonts w:ascii="Helvetica" w:hAnsi="Arial"/>
                 <w:b/>
                 <w:sz w:val="22"/>
               </w:rPr>
@@ -1342,7 +1355,7 @@
             </w:pPr>
             <w:r>
               <w:rPr>
-                <w:rFonts w:ascii="Calibri" w:hAnsi="Calibri"/>
+                <w:rFonts w:ascii="Helvetica" w:hAnsi="Arial"/>
                 <w:b w:val="0"/>
                 <w:sz w:val="22"/>
               </w:rPr>
@@ -1393,8 +1406,8 @@
             </w:pPr>
             <w:r>
               <w:rPr>
-                <w:rFonts w:ascii="Calibri" w:hAnsi="Calibri"/>
-                <w:b w:val="0"/>
+                <w:rFonts w:ascii="Helvetica" w:hAnsi="Arial"/>
+                <w:b/>
                 <w:sz w:val="22"/>
               </w:rPr>
               <w:t>Signatures:</w:t>
@@ -1430,7 +1443,7 @@
             <w:r>
               <w:rPr>
                 <w:rFonts w:ascii="Traditional Arabic" w:hAnsi="Traditional Arabic" w:cs="Traditional Arabic"/>
-                <w:b w:val="0"/>
+                <w:b/>
                 <w:sz w:val="24"/>
               </w:rPr>
               <w:t>التوقيعات:</w:t>
@@ -1471,51 +1484,10 @@
 <file path=word/footer1.xml><?xml version="1.0" encoding="utf-8"?>
 <w:ftr xmlns:m="http://schemas.openxmlformats.org/officeDocument/2006/math" xmlns:mc="http://schemas.openxmlformats.org/markup-compatibility/2006" xmlns:mo="http://schemas.microsoft.com/office/mac/office/2008/main" xmlns:mv="urn:schemas-microsoft-com:mac:vml" xmlns:o="urn:schemas-microsoft-com:office:office" xmlns:r="http://schemas.openxmlformats.org/officeDocument/2006/relationships" xmlns:v="urn:schemas-microsoft-com:vml" xmlns:w10="urn:schemas-microsoft-com:office:word" xmlns:w14="http://schemas.microsoft.com/office/word/2010/wordml" xmlns:w="http://schemas.openxmlformats.org/wordprocessingml/2006/main" xmlns:wne="http://schemas.microsoft.com/office/word/2006/wordml" xmlns:wp14="http://schemas.microsoft.com/office/word/2010/wordprocessingDrawing" xmlns:wp="http://schemas.openxmlformats.org/drawingml/2006/wordprocessingDrawing" xmlns:wpc="http://schemas.microsoft.com/office/word/2010/wordprocessingCanvas" xmlns:wpg="http://schemas.microsoft.com/office/word/2010/wordprocessingGroup" xmlns:wpi="http://schemas.microsoft.com/office/word/2010/wordprocessingInk" xmlns:wps="http://schemas.microsoft.com/office/word/2010/wordprocessingShape" mc:Ignorable="w14 wp14">
   <w:p>
-    <w:r>
-      <w:t xml:space="preserve">Page </w:t>
-    </w:r>
-    <w:r>
-      <w:fldChar w:fldCharType="begin"/>
-    </w:r>
-    <w:r>
-      <w:instrText xml:space="preserve"> PAGE </w:instrText>
-    </w:r>
-    <w:r>
-      <w:fldChar w:fldCharType="separate"/>
-    </w:r>
-    <w:r>
-      <w:t>1</w:t>
-    </w:r>
-    <w:r>
-      <w:fldChar w:fldCharType="end"/>
-    </w:r>
-    <w:r>
-      <w:t xml:space="preserve"> of </w:t>
-    </w:r>
-    <w:r>
-      <w:fldChar w:fldCharType="begin"/>
-    </w:r>
-    <w:r>
-      <w:instrText xml:space="preserve"> NUMPAGES </w:instrText>
-    </w:r>
-    <w:r>
-      <w:fldChar w:fldCharType="separate"/>
-    </w:r>
-    <w:r>
-      <w:t>1</w:t>
-    </w:r>
-    <w:r>
-      <w:fldChar w:fldCharType="end"/>
-    </w:r>
-  </w:p>
-</w:ftr>
-</file>
-
-<file path=word/header1.xml><?xml version="1.0" encoding="utf-8"?>
-<w:hdr xmlns:m="http://schemas.openxmlformats.org/officeDocument/2006/math" xmlns:mc="http://schemas.openxmlformats.org/markup-compatibility/2006" xmlns:mo="http://schemas.microsoft.com/office/mac/office/2008/main" xmlns:mv="urn:schemas-microsoft-com:mac:vml" xmlns:o="urn:schemas-microsoft-com:office:office" xmlns:r="http://schemas.openxmlformats.org/officeDocument/2006/relationships" xmlns:v="urn:schemas-microsoft-com:vml" xmlns:w10="urn:schemas-microsoft-com:office:word" xmlns:w14="http://schemas.microsoft.com/office/word/2010/wordml" xmlns:w="http://schemas.openxmlformats.org/wordprocessingml/2006/main" xmlns:wne="http://schemas.microsoft.com/office/word/2006/wordml" xmlns:wp14="http://schemas.microsoft.com/office/word/2010/wordprocessingDrawing" xmlns:wp="http://schemas.openxmlformats.org/drawingml/2006/wordprocessingDrawing" xmlns:wpc="http://schemas.microsoft.com/office/word/2010/wordprocessingCanvas" xmlns:wpg="http://schemas.microsoft.com/office/word/2010/wordprocessingGroup" xmlns:wpi="http://schemas.microsoft.com/office/word/2010/wordprocessingInk" xmlns:wps="http://schemas.microsoft.com/office/word/2010/wordprocessingShape" mc:Ignorable="w14 wp14">
-  <w:p>
-    <w:pPr>
-      <w:pStyle w:val="Header"/>
+    <w:pPr>
+      <w:pBdr>
+        <w:bottom w:val="single" w:sz="8" w:space="1" w:color="C8A84B"/>
+      </w:pBdr>
     </w:pPr>
   </w:p>
   <w:tbl>
@@ -1525,77 +1497,46 @@
       <w:tblLook w:firstColumn="1" w:firstRow="1" w:lastColumn="0" w:lastRow="0" w:noHBand="0" w:noVBand="1" w:val="04A0"/>
     </w:tblPr>
     <w:tblGrid>
-      <w:gridCol w:w="1984"/>
-      <w:gridCol w:w="5386"/>
-      <w:gridCol w:w="2268"/>
+      <w:gridCol w:w="5112"/>
+      <w:gridCol w:w="5112"/>
     </w:tblGrid>
     <w:tr>
       <w:tc>
         <w:tcPr>
-          <w:tcW w:type="dxa" w:w="3213"/>
-        </w:tcPr>
-        <w:p>
-          <w:r/>
-        </w:p>
-      </w:tc>
-      <w:tc>
-        <w:tcPr>
-          <w:tcW w:type="dxa" w:w="3213"/>
+          <w:tcW w:type="dxa" w:w="5112"/>
+          <w:shd w:val="clear" w:color="auto" w:fill="1E1E1E"/>
         </w:tcPr>
         <w:p>
           <w:pPr>
-            <w:jc w:val="center"/>
+            <w:jc w:val="left"/>
           </w:pPr>
           <w:r>
             <w:rPr>
+              <w:rFonts w:ascii="Helvetica" w:hAnsi="Arial"/>
               <w:b/>
+              <w:color w:val="FFFFFF"/>
+              <w:sz w:val="22"/>
             </w:rPr>
-            <w:t>[LOGO AXIRA / شعار أكسيرا]</w:t>
+            <w:t>AXIRA TRADING FZE</w:t>
+            <w:br/>
           </w:r>
-        </w:p>
-        <w:p>
-          <w:pPr>
-            <w:jc w:val="center"/>
-          </w:pPr>
           <w:r>
             <w:rPr>
-              <w:rFonts w:ascii="Calibri" w:hAnsi="Calibri"/>
+              <w:rFonts w:ascii="Helvetica" w:hAnsi="Arial"/>
               <w:b/>
-              <w:sz w:val="28"/>
+              <w:color w:val="E6E6E6"/>
+              <w:sz w:val="22"/>
             </w:rPr>
-            <w:t>AXIRA TRADING FZE</w:t>
-          </w:r>
-        </w:p>
-        <w:p>
-          <w:pPr>
-            <w:jc w:val="center"/>
-          </w:pPr>
-          <w:r>
-            <w:rPr>
-              <w:rFonts w:ascii="Calibri" w:hAnsi="Calibri"/>
-              <w:b w:val="0"/>
-              <w:sz w:val="20"/>
-            </w:rPr>
-            <w:t>N° de licence / رقم الرخصة: {{fze_license_number}}</w:t>
-          </w:r>
-        </w:p>
-        <w:p>
-          <w:pPr>
-            <w:jc w:val="center"/>
-          </w:pPr>
-          <w:r>
-            <w:rPr>
-              <w:rFonts w:ascii="Calibri" w:hAnsi="Calibri"/>
-              <w:b w:val="0"/>
-              <w:sz w:val="20"/>
-            </w:rPr>
-            <w:t>Adresse / العنوان: {{fze_address}}</w:t>
+            <w:t>{{fze_phone}} | {{fze_email}}</w:t>
+            <w:br/>
+            <w:t>{{fze_address}}</w:t>
           </w:r>
         </w:p>
       </w:tc>
       <w:tc>
         <w:tcPr>
-          <w:tcW w:type="dxa" w:w="3213"/>
+          <w:tcW w:type="dxa" w:w="5112"/>
+          <w:shd w:val="clear" w:color="auto" w:fill="1E1E1E"/>
         </w:tcPr>
         <w:p>
           <w:pPr>
@@ -1603,9 +1544,121 @@
           </w:pPr>
           <w:r>
             <w:rPr>
+              <w:rFonts w:ascii="Helvetica" w:hAnsi="Arial"/>
               <w:b/>
+              <w:color w:val="FFFFFF"/>
+              <w:sz w:val="22"/>
             </w:rPr>
-            <w:t>Référence du contrat / مرجع العقد: {{contract_reference}}</w:t>
+            <w:t>AXIRA AUTO (ALGÉRIE)</w:t>
+            <w:br/>
+          </w:r>
+          <w:r>
+            <w:rPr>
+              <w:rFonts w:ascii="Helvetica" w:hAnsi="Arial"/>
+              <w:b/>
+              <w:color w:val="E6E6E6"/>
+              <w:sz w:val="22"/>
+            </w:rPr>
+            <w:t>{{auto_phone}} | {{auto_email}}</w:t>
+            <w:br/>
+            <w:t>{{auto_address}}</w:t>
+          </w:r>
+        </w:p>
+      </w:tc>
+    </w:tr>
+  </w:tbl>
+  <w:p>
+    <w:pPr>
+      <w:jc w:val="center"/>
+    </w:pPr>
+    <w:r>
+      <w:rPr>
+        <w:sz w:val="18"/>
+      </w:rPr>
+      <w:t xml:space="preserve">Page </w:t>
+    </w:r>
+    <w:fldSimple w:instr="PAGE"/>
+    <w:r>
+      <w:t xml:space="preserve"> of </w:t>
+    </w:r>
+    <w:fldSimple w:instr="NUMPAGES"/>
+  </w:p>
+</w:ftr>
+</file>
+
+<file path=word/header1.xml><?xml version="1.0" encoding="utf-8"?>
+<w:hdr xmlns:m="http://schemas.openxmlformats.org/officeDocument/2006/math" xmlns:mc="http://schemas.openxmlformats.org/markup-compatibility/2006" xmlns:mo="http://schemas.microsoft.com/office/mac/office/2008/main" xmlns:mv="urn:schemas-microsoft-com:mac:vml" xmlns:o="urn:schemas-microsoft-com:office:office" xmlns:r="http://schemas.openxmlformats.org/officeDocument/2006/relationships" xmlns:v="urn:schemas-microsoft-com:vml" xmlns:w10="urn:schemas-microsoft-com:office:word" xmlns:w14="http://schemas.microsoft.com/office/word/2010/wordml" xmlns:w="http://schemas.openxmlformats.org/wordprocessingml/2006/main" xmlns:wne="http://schemas.microsoft.com/office/word/2006/wordml" xmlns:wp14="http://schemas.microsoft.com/office/word/2010/wordprocessingDrawing" xmlns:wp="http://schemas.openxmlformats.org/drawingml/2006/wordprocessingDrawing" xmlns:wpc="http://schemas.microsoft.com/office/word/2010/wordprocessingCanvas" xmlns:wpg="http://schemas.microsoft.com/office/word/2010/wordprocessingGroup" xmlns:wpi="http://schemas.microsoft.com/office/word/2010/wordprocessingInk" xmlns:wps="http://schemas.microsoft.com/office/word/2010/wordprocessingShape" mc:Ignorable="w14 wp14">
+  <w:tbl>
+    <w:tblPr>
+      <w:tblW w:type="auto" w:w="0"/>
+      <w:jc w:val="center"/>
+      <w:tblLook w:firstColumn="1" w:firstRow="1" w:lastColumn="0" w:lastRow="0" w:noHBand="0" w:noVBand="1" w:val="04A0"/>
+    </w:tblPr>
+    <w:tblGrid>
+      <w:gridCol w:w="4608"/>
+      <w:gridCol w:w="5616"/>
+    </w:tblGrid>
+    <w:tr>
+      <w:tc>
+        <w:tcPr>
+          <w:tcW w:type="dxa" w:w="5112"/>
+        </w:tcPr>
+        <w:p>
+          <w:pPr>
+            <w:jc w:val="left"/>
+          </w:pPr>
+          <w:r>
+            <w:drawing>
+              <wp:inline xmlns:a="http://schemas.openxmlformats.org/drawingml/2006/main" xmlns:pic="http://schemas.openxmlformats.org/drawingml/2006/picture">
+                <wp:extent cx="1417320" cy="318897"/>
+                <wp:docPr id="1" name="Picture 1"/>
+                <wp:cNvGraphicFramePr>
+                  <a:graphicFrameLocks noChangeAspect="1"/>
+                </wp:cNvGraphicFramePr>
+                <a:graphic>
+                  <a:graphicData uri="http://schemas.openxmlformats.org/drawingml/2006/picture">
+                    <pic:pic>
+                      <pic:nvPicPr>
+                        <pic:cNvPr id="0" name="axira-logo.png"/>
+                        <pic:cNvPicPr/>
+                      </pic:nvPicPr>
+                      <pic:blipFill>
+                        <a:blip r:embed="rId1"/>
+                        <a:stretch>
+                          <a:fillRect/>
+                        </a:stretch>
+                      </pic:blipFill>
+                      <pic:spPr>
+                        <a:xfrm>
+                          <a:off x="0" y="0"/>
+                          <a:ext cx="1417320" cy="318897"/>
+                        </a:xfrm>
+                        <a:prstGeom prst="rect"/>
+                      </pic:spPr>
+                    </pic:pic>
+                  </a:graphicData>
+                </a:graphic>
+              </wp:inline>
+            </w:drawing>
+          </w:r>
+        </w:p>
+      </w:tc>
+      <w:tc>
+        <w:tcPr>
+          <w:tcW w:type="dxa" w:w="5112"/>
+        </w:tcPr>
+        <w:p>
+          <w:pPr>
+            <w:jc w:val="right"/>
+          </w:pPr>
+          <w:r>
+            <w:rPr>
+              <w:rFonts w:ascii="Helvetica" w:hAnsi="Arial"/>
+              <w:b/>
+              <w:color w:val="1E1E1E"/>
+              <w:sz w:val="22"/>
+            </w:rPr>
+            <w:t>AXIRA TRADING FZE</w:t>
           </w:r>
         </w:p>
         <w:p>
@@ -1614,14 +1667,32 @@
           </w:pPr>
           <w:r>
             <w:rPr>
+              <w:rFonts w:ascii="Traditional Arabic" w:hAnsi="Traditional Arabic" w:cs="Traditional Arabic"/>
               <w:b/>
+              <w:sz w:val="24"/>
             </w:rPr>
+            <w:t>Réf. contrat / مرجع العقد: {{contract_reference}}</w:t>
+            <w:br/>
             <w:t>Date / التاريخ: {{contract_date}}</w:t>
           </w:r>
         </w:p>
       </w:tc>
     </w:tr>
   </w:tbl>
+  <w:p>
+    <w:pPr>
+      <w:pBdr>
+        <w:bottom w:val="single" w:sz="8" w:space="1" w:color="C8A84B"/>
+      </w:pBdr>
+    </w:pPr>
+  </w:p>
+  <w:p>
+    <w:pPr>
+      <w:pBdr>
+        <w:bottom w:val="single" w:sz="4" w:space="1" w:color="1E1E1E"/>
+      </w:pBdr>
+    </w:pPr>
+  </w:p>
 </w:hdr>
 </file>
 
@@ -1988,6 +2059,10 @@
     <w:name w:val="Normal"/>
     <w:qFormat/>
     <w:rsid w:val="00FC693F"/>
+    <w:rPr>
+      <w:rFonts w:ascii="Helvetica" w:hAnsi="Arial"/>
+      <w:sz w:val="22"/>
+    </w:rPr>
   </w:style>
   <w:style w:type="paragraph" w:styleId="Header">
     <w:name w:val="header"/>

</xml_diff>